<commit_message>
Actualiza entregables de simulacion de redes
</commit_message>
<xml_diff>
--- a/tarea3/outputs/Informe_Tecnico_Simulador_Redes.docx
+++ b/tarea3/outputs/Informe_Tecnico_Simulador_Redes.docx
@@ -256,7 +256,7 @@
           </w:tcPr>
           <w:p>
             <w:r>
-              <w:t>60.0 s</w:t>
+              <w:t>20.12 s</w:t>
             </w:r>
           </w:p>
         </w:tc>
@@ -372,7 +372,7 @@
           </w:tcPr>
           <w:p>
             <w:r>
-              <w:t>857</w:t>
+              <w:t>269</w:t>
             </w:r>
           </w:p>
         </w:tc>
@@ -440,7 +440,7 @@
           </w:tcPr>
           <w:p>
             <w:r>
-              <w:t>0.0608 s</w:t>
+              <w:t>0.0454 s</w:t>
             </w:r>
           </w:p>
         </w:tc>
@@ -464,7 +464,7 @@
           </w:tcPr>
           <w:p>
             <w:r>
-              <w:t>1.11</w:t>
+              <w:t>1.27</w:t>
             </w:r>
           </w:p>
         </w:tc>
@@ -486,7 +486,7 @@
           </w:tcPr>
           <w:p>
             <w:r>
-              <w:t>0.87</w:t>
+              <w:t>0.61</w:t>
             </w:r>
           </w:p>
         </w:tc>
@@ -510,7 +510,7 @@
           </w:tcPr>
           <w:p>
             <w:r>
-              <w:t>$2.61</w:t>
+              <w:t>$0.61</w:t>
             </w:r>
           </w:p>
         </w:tc>
@@ -556,7 +556,7 @@
           </w:tcPr>
           <w:p>
             <w:r>
-              <w:t>$2.61</w:t>
+              <w:t>$0.61</w:t>
             </w:r>
           </w:p>
         </w:tc>
@@ -575,12 +575,79 @@
           <w:color w:val="0F172A"/>
           <w:sz w:val="26"/>
         </w:rPr>
+        <w:t>4. Evidencia Visual del Simulador Interactivo</w:t>
+      </w:r>
+    </w:p>
+    <w:p>
+      <w:pPr>
+        <w:jc w:val="center"/>
+      </w:pPr>
+      <w:r>
+        <w:drawing>
+          <wp:inline xmlns:a="http://schemas.openxmlformats.org/drawingml/2006/main" xmlns:pic="http://schemas.openxmlformats.org/drawingml/2006/picture">
+            <wp:extent cx="5669280" cy="3329577"/>
+            <wp:docPr id="1" name="Picture 1"/>
+            <wp:cNvGraphicFramePr>
+              <a:graphicFrameLocks noChangeAspect="1"/>
+            </wp:cNvGraphicFramePr>
+            <a:graphic>
+              <a:graphicData uri="http://schemas.openxmlformats.org/drawingml/2006/picture">
+                <pic:pic>
+                  <pic:nvPicPr>
+                    <pic:cNvPr id="0" name="captura_simulacion.png"/>
+                    <pic:cNvPicPr/>
+                  </pic:nvPicPr>
+                  <pic:blipFill>
+                    <a:blip r:embed="rId9"/>
+                    <a:stretch>
+                      <a:fillRect/>
+                    </a:stretch>
+                  </pic:blipFill>
+                  <pic:spPr>
+                    <a:xfrm>
+                      <a:off x="0" y="0"/>
+                      <a:ext cx="5669280" cy="3329577"/>
+                    </a:xfrm>
+                    <a:prstGeom prst="rect"/>
+                  </pic:spPr>
+                </pic:pic>
+              </a:graphicData>
+            </a:graphic>
+          </wp:inline>
+        </w:drawing>
+      </w:r>
+    </w:p>
+    <w:p>
+      <w:pPr>
+        <w:jc w:val="center"/>
+      </w:pPr>
+      <w:r>
+        <w:rPr>
+          <w:i/>
+          <w:color w:val="64748B"/>
+          <w:sz w:val="18"/>
+        </w:rPr>
+        <w:t>Figura 1: Topologia de red dinamica con dashboard HUD en Pygame.</w:t>
+      </w:r>
+    </w:p>
+    <w:p>
+      <w:pPr>
+        <w:keepNext/>
+        <w:spacing w:before="280" w:after="120"/>
+      </w:pPr>
+      <w:r>
+        <w:rPr>
+          <w:rFonts w:ascii="Arial" w:hAnsi="Arial"/>
+          <w:b/>
+          <w:color w:val="0F172A"/>
+          <w:sz w:val="26"/>
+        </w:rPr>
         <w:t>5. Diagnostico Automatizado de Inteligencia Artificial</w:t>
       </w:r>
     </w:p>
     <w:p>
       <w:r>
-        <w:t>A continuación se presenta el análisis técnico y cuantitativo del reporte de simulación suministrado.</w:t>
+        <w:t>A continuación se presenta el análisis técnico del reporte de simulación de red, integrando los principios de teoría de colas, gestión de inventario y optimización de recursos.</w:t>
       </w:r>
     </w:p>
     <w:p>
@@ -590,70 +657,14 @@
     </w:p>
     <w:p>
       <w:r>
-        <w:t>### 1. Diagnóstico de Eficiencia y Teoría de Colas ($M/M/1/K$ y Factor $\rho$)</w:t>
+        <w:t>### 1. Diagnóstico de Eficiencia y Teoría de Colas ($M/M/1/K$ y factor $\rho$)</w:t>
       </w:r>
     </w:p>
     <w:p>
       <w:r>
-        <w:t>* **Factor de Utilización del Servidor ($\rho$):**</w:t>
+        <w:t>* **Factor de Utilización ($\rho$):**</w:t>
         <w:br/>
-        <w:t xml:space="preserve">  $$\rho = \frac{\lambda}{\mu} = \frac{15.0 \text{ paq/s}}{18.0 \text{ paq/s}} \approx 0.8333 \quad (83.33\%)$$</w:t>
-        <w:br/>
-        <w:t xml:space="preserve">  El sistema opera en una zona de alta carga ($\rho &gt; 0.80$), pero se mantiene en régimen estrictamente ergódico y estable ($\rho &lt; 1$). El servidor atiende a una velocidad $1.2$ veces mayor que la demanda promedio.</w:t>
-      </w:r>
-    </w:p>
-    <w:p>
-      <w:r>
-        <w:t>* **Comportamiento $M/M/1/K$ (donde $K = S = 50$):**</w:t>
-        <w:br/>
-        <w:t xml:space="preserve">  En un modelo $M/M/1/K$, la probabilidad teórica de bloqueo o pérdida $P_K$ por desbordamiento de búfer está dada por:</w:t>
-        <w:br/>
-        <w:t xml:space="preserve">  $$P_K = \frac{(1 - \rho)\rho^K}{1 - \rho^{K+1}}$$</w:t>
-        <w:br/>
-        <w:t xml:space="preserve">  Sustituyendo $\rho = 0.8333$ y $K = 50$:</w:t>
-        <w:br/>
-        <w:t xml:space="preserve">  $$P_K \approx \frac{(0.1667)(0.8333)^{50}}{1 - (0.8333)^{51}} \approx 1.51 \times 10^{-5} \quad (0.0015\%)$$</w:t>
-        <w:br/>
-        <w:t xml:space="preserve">  Esto explica con rigor analítico por qué la **Tasa de Pérdida observada es de 0.00%** para un volumen de 857 paquetes procesados: la ventana temporal (60 s) y el tamaño muestral son insuficientes para registrar un evento raro de desbordamiento.</w:t>
-      </w:r>
-    </w:p>
-    <w:p>
-      <w:r>
-        <w:t>* **Tiempos y Ocupación del Sistema:**</w:t>
-        <w:br/>
-        <w:t xml:space="preserve">  * **Tiempo de espera en cola ($W_q = 0.0608\text{ s}$ o $60.8\text{ ms}$):** Corresponde a un retraso de procesamiento bajo para enlaces de datos estándar.</w:t>
-        <w:br/>
-        <w:t xml:space="preserve">  * **Tiempo total en el sistema ($W$):** $W = W_q + \frac{1}{\mu} = 0.0608 + \frac{1}{18} \approx 0.1164\text{ s}$ ($116.4\text{ ms}$).</w:t>
-        <w:br/>
-        <w:t xml:space="preserve">  * **Consistencia con Ley de Little:** $L = \lambda \cdot W \approx 15 \times 0.1164 \approx 1.74$ paquetes en estado estacionario teórico. El valor simulado ($L = 1.11$) es ligeramente inferior, atribuible a las condiciones iniciales del sistema (cola vacía al inicio de los 60 s).</w:t>
-      </w:r>
-    </w:p>
-    <w:p>
-      <w:r>
-        <w:t>---</w:t>
-      </w:r>
-    </w:p>
-    <w:p>
-      <w:r>
-        <w:t>### 2. Evaluación del Control de Inventario en Buffers (Política $(s, S)$, Desborde y Costos)</w:t>
-      </w:r>
-    </w:p>
-    <w:p>
-      <w:r>
-        <w:t>En esta analogía entre redes de datos y gestión de inventario estocástico:</w:t>
-        <w:br/>
-        <w:t>* **Capacidad Máxima ($S = 50$):** Capacidad del búfer (almacén).</w:t>
-        <w:br/>
-        <w:t>* **Umbral de Reabastecimiento ($s = 10$):** Nivel que dispara solicitudes de control de flujo o créditos (ej. ventanas TCP o paquetes de control ICMP Source Quench / BCN).</w:t>
-      </w:r>
-    </w:p>
-    <w:p>
-      <w:r>
-        <w:t>* **Análisis de Costos:**</w:t>
-        <w:br/>
-        <w:t xml:space="preserve">  * **Costo de Ruptura ($0.00):** Al no haber pérdidas por descarte de cola (*drop tail*), no existen penalizaciones por incumplimiento de Acuerdos de Nivel de Servicio (SLA) ni retransmisiones.</w:t>
-        <w:br/>
-        <w:t xml:space="preserve">  * **Costo de Almacenamiento ($2.61):** Representa el consumo de memoria y retención en búfer durante el horizonte temporal ($T = 60\text{ s}$). Dado que $L = 1.11$, el costo unitario de mantener</w:t>
+        <w:t xml:space="preserve">  $$\rho = \frac{\lambda}{\mu} = \frac{15.0\text{ paq/s}}{18.0\text{ paq/s</w:t>
       </w:r>
     </w:p>
     <w:sectPr>

</xml_diff>